<commit_message>
Questionário em versão direta, só com as perguntas
Co-Authored-By: Claude Opus 5.5 (1M context) <noreply@anthropic.com>
Claude-Session: https://claude.ai/code/session_013Ez8WdXVGnAz1jp93VScRd
</commit_message>
<xml_diff>
--- a/docs/questionario/questionario-TAM-provisa.docx
+++ b/docs/questionario/questionario-TAM-provisa.docx
@@ -42,779 +42,7 @@
         <w:pStyle w:val="Heading1"/>
       </w:pPr>
       <w:r>
-        <w:t>1. Apresentação</w:t>
-      </w:r>
-    </w:p>
-    <w:p>
-      <w:r>
-        <w:t>Este questionário mede a aceitação do Provisa pelos profissionais de compras do hospital, com base no Modelo de Aceitação de Tecnologia (TAM) de Davis (1989). O TAM explica a adoção de um sistema por duas percepções do usuário: o quanto ele é útil e o quanto é fácil de usar.</w:t>
-      </w:r>
-    </w:p>
-    <w:tbl>
-      <w:tblPr>
-        <w:tblStyle w:val="TableGrid"/>
-        <w:tblW w:type="auto" w:w="0"/>
-        <w:jc w:val="center"/>
-        <w:tblLayout w:type="fixed"/>
-        <w:tblLook w:firstColumn="1" w:firstRow="1" w:lastColumn="0" w:lastRow="0" w:noHBand="0" w:noVBand="1" w:val="04A0"/>
-      </w:tblPr>
-      <w:tblGrid>
-        <w:gridCol w:w="2381"/>
-        <w:gridCol w:w="850"/>
-        <w:gridCol w:w="5102"/>
-        <w:gridCol w:w="850"/>
-      </w:tblGrid>
-      <w:tr>
-        <w:trPr>
-          <w:tblHeader w:val="true"/>
-        </w:trPr>
-        <w:tc>
-          <w:tcPr>
-            <w:tcW w:type="dxa" w:w="2381"/>
-            <w:shd w:val="clear" w:color="auto" w:fill="154C47"/>
-            <w:vAlign w:val="center"/>
-          </w:tcPr>
-          <w:p>
-            <w:r/>
-            <w:r>
-              <w:rPr>
-                <w:b/>
-                <w:color w:val="FFFFFF"/>
-                <w:sz w:val="18"/>
-              </w:rPr>
-              <w:t>Construto</w:t>
-            </w:r>
-          </w:p>
-        </w:tc>
-        <w:tc>
-          <w:tcPr>
-            <w:tcW w:type="dxa" w:w="850"/>
-            <w:shd w:val="clear" w:color="auto" w:fill="154C47"/>
-            <w:vAlign w:val="center"/>
-          </w:tcPr>
-          <w:p>
-            <w:pPr>
-              <w:jc w:val="center"/>
-            </w:pPr>
-            <w:r/>
-            <w:r>
-              <w:rPr>
-                <w:b/>
-                <w:color w:val="FFFFFF"/>
-                <w:sz w:val="18"/>
-              </w:rPr>
-              <w:t>Sigla</w:t>
-            </w:r>
-          </w:p>
-        </w:tc>
-        <w:tc>
-          <w:tcPr>
-            <w:tcW w:type="dxa" w:w="5102"/>
-            <w:shd w:val="clear" w:color="auto" w:fill="154C47"/>
-            <w:vAlign w:val="center"/>
-          </w:tcPr>
-          <w:p>
-            <w:r/>
-            <w:r>
-              <w:rPr>
-                <w:b/>
-                <w:color w:val="FFFFFF"/>
-                <w:sz w:val="18"/>
-              </w:rPr>
-              <w:t>O que mede</w:t>
-            </w:r>
-          </w:p>
-        </w:tc>
-        <w:tc>
-          <w:tcPr>
-            <w:tcW w:type="dxa" w:w="850"/>
-            <w:shd w:val="clear" w:color="auto" w:fill="154C47"/>
-            <w:vAlign w:val="center"/>
-          </w:tcPr>
-          <w:p>
-            <w:pPr>
-              <w:jc w:val="center"/>
-            </w:pPr>
-            <w:r/>
-            <w:r>
-              <w:rPr>
-                <w:b/>
-                <w:color w:val="FFFFFF"/>
-                <w:sz w:val="18"/>
-              </w:rPr>
-              <w:t>Itens</w:t>
-            </w:r>
-          </w:p>
-        </w:tc>
-      </w:tr>
-      <w:tr>
-        <w:trPr>
-          <w:cantSplit w:val="true"/>
-        </w:trPr>
-        <w:tc>
-          <w:tcPr>
-            <w:tcW w:type="dxa" w:w="2381"/>
-            <w:vAlign w:val="center"/>
-          </w:tcPr>
-          <w:p>
-            <w:pPr>
-              <w:spacing w:after="40"/>
-            </w:pPr>
-            <w:r/>
-            <w:r>
-              <w:rPr>
-                <w:sz w:val="20"/>
-              </w:rPr>
-              <w:t>Utilidade Percebida</w:t>
-            </w:r>
-          </w:p>
-        </w:tc>
-        <w:tc>
-          <w:tcPr>
-            <w:tcW w:type="dxa" w:w="850"/>
-            <w:vAlign w:val="center"/>
-          </w:tcPr>
-          <w:p>
-            <w:pPr>
-              <w:spacing w:after="40"/>
-              <w:jc w:val="center"/>
-            </w:pPr>
-            <w:r/>
-            <w:r>
-              <w:rPr>
-                <w:sz w:val="20"/>
-              </w:rPr>
-              <w:t>UP</w:t>
-            </w:r>
-          </w:p>
-        </w:tc>
-        <w:tc>
-          <w:tcPr>
-            <w:tcW w:type="dxa" w:w="5102"/>
-            <w:vAlign w:val="center"/>
-          </w:tcPr>
-          <w:p>
-            <w:pPr>
-              <w:spacing w:after="40"/>
-            </w:pPr>
-            <w:r/>
-            <w:r>
-              <w:rPr>
-                <w:sz w:val="20"/>
-              </w:rPr>
-              <w:t>Grau em que a pessoa acredita que o Provisa melhora o seu desempenho nas compras</w:t>
-            </w:r>
-          </w:p>
-        </w:tc>
-        <w:tc>
-          <w:tcPr>
-            <w:tcW w:type="dxa" w:w="850"/>
-            <w:vAlign w:val="center"/>
-          </w:tcPr>
-          <w:p>
-            <w:pPr>
-              <w:spacing w:after="40"/>
-              <w:jc w:val="center"/>
-            </w:pPr>
-            <w:r/>
-            <w:r>
-              <w:rPr>
-                <w:sz w:val="20"/>
-              </w:rPr>
-              <w:t>8</w:t>
-            </w:r>
-          </w:p>
-        </w:tc>
-      </w:tr>
-      <w:tr>
-        <w:trPr>
-          <w:cantSplit w:val="true"/>
-        </w:trPr>
-        <w:tc>
-          <w:tcPr>
-            <w:tcW w:type="dxa" w:w="2381"/>
-            <w:vAlign w:val="center"/>
-            <w:shd w:val="clear" w:color="auto" w:fill="EEF7F5"/>
-          </w:tcPr>
-          <w:p>
-            <w:pPr>
-              <w:spacing w:after="40"/>
-            </w:pPr>
-            <w:r/>
-            <w:r>
-              <w:rPr>
-                <w:sz w:val="20"/>
-              </w:rPr>
-              <w:t>Facilidade de Uso Percebida</w:t>
-            </w:r>
-          </w:p>
-        </w:tc>
-        <w:tc>
-          <w:tcPr>
-            <w:tcW w:type="dxa" w:w="850"/>
-            <w:vAlign w:val="center"/>
-            <w:shd w:val="clear" w:color="auto" w:fill="EEF7F5"/>
-          </w:tcPr>
-          <w:p>
-            <w:pPr>
-              <w:spacing w:after="40"/>
-              <w:jc w:val="center"/>
-            </w:pPr>
-            <w:r/>
-            <w:r>
-              <w:rPr>
-                <w:sz w:val="20"/>
-              </w:rPr>
-              <w:t>FUP</w:t>
-            </w:r>
-          </w:p>
-        </w:tc>
-        <w:tc>
-          <w:tcPr>
-            <w:tcW w:type="dxa" w:w="5102"/>
-            <w:vAlign w:val="center"/>
-            <w:shd w:val="clear" w:color="auto" w:fill="EEF7F5"/>
-          </w:tcPr>
-          <w:p>
-            <w:pPr>
-              <w:spacing w:after="40"/>
-            </w:pPr>
-            <w:r/>
-            <w:r>
-              <w:rPr>
-                <w:sz w:val="20"/>
-              </w:rPr>
-              <w:t>Grau em que a pessoa acredita que usar o Provisa exige pouco esforço</w:t>
-            </w:r>
-          </w:p>
-        </w:tc>
-        <w:tc>
-          <w:tcPr>
-            <w:tcW w:type="dxa" w:w="850"/>
-            <w:vAlign w:val="center"/>
-            <w:shd w:val="clear" w:color="auto" w:fill="EEF7F5"/>
-          </w:tcPr>
-          <w:p>
-            <w:pPr>
-              <w:spacing w:after="40"/>
-              <w:jc w:val="center"/>
-            </w:pPr>
-            <w:r/>
-            <w:r>
-              <w:rPr>
-                <w:sz w:val="20"/>
-              </w:rPr>
-              <w:t>6</w:t>
-            </w:r>
-          </w:p>
-        </w:tc>
-      </w:tr>
-      <w:tr>
-        <w:trPr>
-          <w:cantSplit w:val="true"/>
-        </w:trPr>
-        <w:tc>
-          <w:tcPr>
-            <w:tcW w:type="dxa" w:w="2381"/>
-            <w:vAlign w:val="center"/>
-          </w:tcPr>
-          <w:p>
-            <w:pPr>
-              <w:spacing w:after="40"/>
-            </w:pPr>
-            <w:r/>
-            <w:r>
-              <w:rPr>
-                <w:sz w:val="20"/>
-              </w:rPr>
-              <w:t>Atitude em relação ao uso</w:t>
-            </w:r>
-          </w:p>
-        </w:tc>
-        <w:tc>
-          <w:tcPr>
-            <w:tcW w:type="dxa" w:w="850"/>
-            <w:vAlign w:val="center"/>
-          </w:tcPr>
-          <w:p>
-            <w:pPr>
-              <w:spacing w:after="40"/>
-              <w:jc w:val="center"/>
-            </w:pPr>
-            <w:r/>
-            <w:r>
-              <w:rPr>
-                <w:sz w:val="20"/>
-              </w:rPr>
-              <w:t>AT</w:t>
-            </w:r>
-          </w:p>
-        </w:tc>
-        <w:tc>
-          <w:tcPr>
-            <w:tcW w:type="dxa" w:w="5102"/>
-            <w:vAlign w:val="center"/>
-          </w:tcPr>
-          <w:p>
-            <w:pPr>
-              <w:spacing w:after="40"/>
-            </w:pPr>
-            <w:r/>
-            <w:r>
-              <w:rPr>
-                <w:sz w:val="20"/>
-              </w:rPr>
-              <w:t>Avaliação geral, favorável ou não, de usar o sistema</w:t>
-            </w:r>
-          </w:p>
-        </w:tc>
-        <w:tc>
-          <w:tcPr>
-            <w:tcW w:type="dxa" w:w="850"/>
-            <w:vAlign w:val="center"/>
-          </w:tcPr>
-          <w:p>
-            <w:pPr>
-              <w:spacing w:after="40"/>
-              <w:jc w:val="center"/>
-            </w:pPr>
-            <w:r/>
-            <w:r>
-              <w:rPr>
-                <w:sz w:val="20"/>
-              </w:rPr>
-              <w:t>3</w:t>
-            </w:r>
-          </w:p>
-        </w:tc>
-      </w:tr>
-      <w:tr>
-        <w:trPr>
-          <w:cantSplit w:val="true"/>
-        </w:trPr>
-        <w:tc>
-          <w:tcPr>
-            <w:tcW w:type="dxa" w:w="2381"/>
-            <w:vAlign w:val="center"/>
-            <w:shd w:val="clear" w:color="auto" w:fill="EEF7F5"/>
-          </w:tcPr>
-          <w:p>
-            <w:pPr>
-              <w:spacing w:after="40"/>
-            </w:pPr>
-            <w:r/>
-            <w:r>
-              <w:rPr>
-                <w:sz w:val="20"/>
-              </w:rPr>
-              <w:t>Intenção de Uso</w:t>
-            </w:r>
-          </w:p>
-        </w:tc>
-        <w:tc>
-          <w:tcPr>
-            <w:tcW w:type="dxa" w:w="850"/>
-            <w:vAlign w:val="center"/>
-            <w:shd w:val="clear" w:color="auto" w:fill="EEF7F5"/>
-          </w:tcPr>
-          <w:p>
-            <w:pPr>
-              <w:spacing w:after="40"/>
-              <w:jc w:val="center"/>
-            </w:pPr>
-            <w:r/>
-            <w:r>
-              <w:rPr>
-                <w:sz w:val="20"/>
-              </w:rPr>
-              <w:t>IU</w:t>
-            </w:r>
-          </w:p>
-        </w:tc>
-        <w:tc>
-          <w:tcPr>
-            <w:tcW w:type="dxa" w:w="5102"/>
-            <w:vAlign w:val="center"/>
-            <w:shd w:val="clear" w:color="auto" w:fill="EEF7F5"/>
-          </w:tcPr>
-          <w:p>
-            <w:pPr>
-              <w:spacing w:after="40"/>
-            </w:pPr>
-            <w:r/>
-            <w:r>
-              <w:rPr>
-                <w:sz w:val="20"/>
-              </w:rPr>
-              <w:t>Disposição de usar o Provisa no trabalho real</w:t>
-            </w:r>
-          </w:p>
-        </w:tc>
-        <w:tc>
-          <w:tcPr>
-            <w:tcW w:type="dxa" w:w="850"/>
-            <w:vAlign w:val="center"/>
-            <w:shd w:val="clear" w:color="auto" w:fill="EEF7F5"/>
-          </w:tcPr>
-          <w:p>
-            <w:pPr>
-              <w:spacing w:after="40"/>
-              <w:jc w:val="center"/>
-            </w:pPr>
-            <w:r/>
-            <w:r>
-              <w:rPr>
-                <w:sz w:val="20"/>
-              </w:rPr>
-              <w:t>3</w:t>
-            </w:r>
-          </w:p>
-        </w:tc>
-      </w:tr>
-    </w:tbl>
-    <w:p/>
-    <w:p>
-      <w:r>
-        <w:t>UP e FUP seguem as escalas originais de Davis (1989), adaptadas ao contexto de compras hospitalares. AT e IU vêm do modelo completo publicado por Davis, Bagozzi e Warshaw (1989). No modelo, FUP influencia UP, e as duas influenciam a atitude e a intenção de uso.</w:t>
-      </w:r>
-    </w:p>
-    <w:p>
-      <w:pPr>
-        <w:pStyle w:val="Heading1"/>
-      </w:pPr>
-      <w:r>
-        <w:t>2. Como aplicar</w:t>
-      </w:r>
-    </w:p>
-    <w:p>
-      <w:r>
-        <w:t>Aplique o questionário logo depois que o participante usar o Provisa em um roteiro curto de tarefas, de 15 a 20 minutos. Assim as respostas refletem o uso real, não só uma apresentação.</w:t>
-      </w:r>
-    </w:p>
-    <w:p>
-      <w:r>
-        <w:rPr>
-          <w:b/>
-        </w:rPr>
-        <w:t xml:space="preserve">Público: </w:t>
-      </w:r>
-      <w:r>
-        <w:t>Compradores e gestores de suprimentos respondem os Blocos A a D; fornecedores respondem o Bloco E. Para um TCC, de 8 a 15 participantes já permite uma análise descritiva consistente.</w:t>
-      </w:r>
-    </w:p>
-    <w:p>
-      <w:r>
-        <w:rPr>
-          <w:b/>
-        </w:rPr>
-        <w:t>Roteiro de tarefas antes do questionário:</w:t>
-      </w:r>
-    </w:p>
-    <w:p>
-      <w:pPr>
-        <w:ind w:left="340"/>
-      </w:pPr>
-      <w:r>
-        <w:t>1. Entrar no sistema e localizar no Dashboard os itens abaixo do estoque mínimo.</w:t>
-      </w:r>
-    </w:p>
-    <w:p>
-      <w:pPr>
-        <w:ind w:left="340"/>
-      </w:pPr>
-      <w:r>
-        <w:t>2. Em Necessidades de compra, verificar o estoque pela API e gerar uma cotação.</w:t>
-      </w:r>
-    </w:p>
-    <w:p>
-      <w:pPr>
-        <w:ind w:left="340"/>
-      </w:pPr>
-      <w:r>
-        <w:t>3. Abrir a cotação, simular as propostas dos fornecedores e analisar o comparativo e a recomendação.</w:t>
-      </w:r>
-    </w:p>
-    <w:p>
-      <w:pPr>
-        <w:ind w:left="340"/>
-      </w:pPr>
-      <w:r>
-        <w:t>4. No simulador de pesos, testar o cenário "Urgência (prazo)" e observar se a recomendação muda.</w:t>
-      </w:r>
-    </w:p>
-    <w:p>
-      <w:pPr>
-        <w:ind w:left="340"/>
-      </w:pPr>
-      <w:r>
-        <w:t>5. Selecionar uma proposta, definir as quantidades e aprovar a compra.</w:t>
-      </w:r>
-    </w:p>
-    <w:p>
-      <w:pPr>
-        <w:ind w:left="340"/>
-      </w:pPr>
-      <w:r>
-        <w:t>6. Abrir o pedido de compra em PDF e conferir o e-mail enviado ao fornecedor.</w:t>
-      </w:r>
-    </w:p>
-    <w:p>
-      <w:pPr>
-        <w:ind w:left="340"/>
-      </w:pPr>
-      <w:r>
-        <w:t>7. Registrar o pagamento e o recebimento da mercadoria.</w:t>
-      </w:r>
-    </w:p>
-    <w:p>
-      <w:r>
-        <w:rPr>
-          <w:b/>
-        </w:rPr>
-        <w:t xml:space="preserve">Escala: </w:t>
-      </w:r>
-      <w:r>
-        <w:t>Likert de 5 pontos em todos os itens fechados.</w:t>
-      </w:r>
-    </w:p>
-    <w:tbl>
-      <w:tblPr>
-        <w:tblStyle w:val="TableGrid"/>
-        <w:tblW w:type="auto" w:w="0"/>
-        <w:jc w:val="center"/>
-        <w:tblLayout w:type="fixed"/>
-        <w:tblLook w:firstColumn="1" w:firstRow="1" w:lastColumn="0" w:lastRow="0" w:noHBand="0" w:noVBand="1" w:val="04A0"/>
-      </w:tblPr>
-      <w:tblGrid>
-        <w:gridCol w:w="1814"/>
-        <w:gridCol w:w="1814"/>
-        <w:gridCol w:w="1814"/>
-        <w:gridCol w:w="1814"/>
-        <w:gridCol w:w="1814"/>
-      </w:tblGrid>
-      <w:tr>
-        <w:trPr>
-          <w:tblHeader w:val="true"/>
-        </w:trPr>
-        <w:tc>
-          <w:tcPr>
-            <w:tcW w:type="dxa" w:w="1814"/>
-            <w:shd w:val="clear" w:color="auto" w:fill="154C47"/>
-            <w:vAlign w:val="center"/>
-          </w:tcPr>
-          <w:p>
-            <w:pPr>
-              <w:jc w:val="center"/>
-            </w:pPr>
-            <w:r/>
-            <w:r>
-              <w:rPr>
-                <w:b/>
-                <w:color w:val="FFFFFF"/>
-                <w:sz w:val="18"/>
-              </w:rPr>
-              <w:t>1</w:t>
-            </w:r>
-          </w:p>
-        </w:tc>
-        <w:tc>
-          <w:tcPr>
-            <w:tcW w:type="dxa" w:w="1814"/>
-            <w:shd w:val="clear" w:color="auto" w:fill="154C47"/>
-            <w:vAlign w:val="center"/>
-          </w:tcPr>
-          <w:p>
-            <w:pPr>
-              <w:jc w:val="center"/>
-            </w:pPr>
-            <w:r/>
-            <w:r>
-              <w:rPr>
-                <w:b/>
-                <w:color w:val="FFFFFF"/>
-                <w:sz w:val="18"/>
-              </w:rPr>
-              <w:t>2</w:t>
-            </w:r>
-          </w:p>
-        </w:tc>
-        <w:tc>
-          <w:tcPr>
-            <w:tcW w:type="dxa" w:w="1814"/>
-            <w:shd w:val="clear" w:color="auto" w:fill="154C47"/>
-            <w:vAlign w:val="center"/>
-          </w:tcPr>
-          <w:p>
-            <w:pPr>
-              <w:jc w:val="center"/>
-            </w:pPr>
-            <w:r/>
-            <w:r>
-              <w:rPr>
-                <w:b/>
-                <w:color w:val="FFFFFF"/>
-                <w:sz w:val="18"/>
-              </w:rPr>
-              <w:t>3</w:t>
-            </w:r>
-          </w:p>
-        </w:tc>
-        <w:tc>
-          <w:tcPr>
-            <w:tcW w:type="dxa" w:w="1814"/>
-            <w:shd w:val="clear" w:color="auto" w:fill="154C47"/>
-            <w:vAlign w:val="center"/>
-          </w:tcPr>
-          <w:p>
-            <w:pPr>
-              <w:jc w:val="center"/>
-            </w:pPr>
-            <w:r/>
-            <w:r>
-              <w:rPr>
-                <w:b/>
-                <w:color w:val="FFFFFF"/>
-                <w:sz w:val="18"/>
-              </w:rPr>
-              <w:t>4</w:t>
-            </w:r>
-          </w:p>
-        </w:tc>
-        <w:tc>
-          <w:tcPr>
-            <w:tcW w:type="dxa" w:w="1814"/>
-            <w:shd w:val="clear" w:color="auto" w:fill="154C47"/>
-            <w:vAlign w:val="center"/>
-          </w:tcPr>
-          <w:p>
-            <w:pPr>
-              <w:jc w:val="center"/>
-            </w:pPr>
-            <w:r/>
-            <w:r>
-              <w:rPr>
-                <w:b/>
-                <w:color w:val="FFFFFF"/>
-                <w:sz w:val="18"/>
-              </w:rPr>
-              <w:t>5</w:t>
-            </w:r>
-          </w:p>
-        </w:tc>
-      </w:tr>
-      <w:tr>
-        <w:trPr>
-          <w:cantSplit w:val="true"/>
-        </w:trPr>
-        <w:tc>
-          <w:tcPr>
-            <w:tcW w:type="dxa" w:w="1814"/>
-            <w:vAlign w:val="center"/>
-          </w:tcPr>
-          <w:p>
-            <w:pPr>
-              <w:spacing w:after="40"/>
-              <w:jc w:val="center"/>
-            </w:pPr>
-            <w:r/>
-            <w:r>
-              <w:rPr>
-                <w:sz w:val="20"/>
-              </w:rPr>
-              <w:t>Discordo totalmente</w:t>
-            </w:r>
-          </w:p>
-        </w:tc>
-        <w:tc>
-          <w:tcPr>
-            <w:tcW w:type="dxa" w:w="1814"/>
-            <w:vAlign w:val="center"/>
-          </w:tcPr>
-          <w:p>
-            <w:pPr>
-              <w:spacing w:after="40"/>
-              <w:jc w:val="center"/>
-            </w:pPr>
-            <w:r/>
-            <w:r>
-              <w:rPr>
-                <w:sz w:val="20"/>
-              </w:rPr>
-              <w:t>Discordo</w:t>
-            </w:r>
-          </w:p>
-        </w:tc>
-        <w:tc>
-          <w:tcPr>
-            <w:tcW w:type="dxa" w:w="1814"/>
-            <w:vAlign w:val="center"/>
-          </w:tcPr>
-          <w:p>
-            <w:pPr>
-              <w:spacing w:after="40"/>
-              <w:jc w:val="center"/>
-            </w:pPr>
-            <w:r/>
-            <w:r>
-              <w:rPr>
-                <w:sz w:val="20"/>
-              </w:rPr>
-              <w:t>Neutro</w:t>
-            </w:r>
-          </w:p>
-        </w:tc>
-        <w:tc>
-          <w:tcPr>
-            <w:tcW w:type="dxa" w:w="1814"/>
-            <w:vAlign w:val="center"/>
-          </w:tcPr>
-          <w:p>
-            <w:pPr>
-              <w:spacing w:after="40"/>
-              <w:jc w:val="center"/>
-            </w:pPr>
-            <w:r/>
-            <w:r>
-              <w:rPr>
-                <w:sz w:val="20"/>
-              </w:rPr>
-              <w:t>Concordo</w:t>
-            </w:r>
-          </w:p>
-        </w:tc>
-        <w:tc>
-          <w:tcPr>
-            <w:tcW w:type="dxa" w:w="1814"/>
-            <w:vAlign w:val="center"/>
-          </w:tcPr>
-          <w:p>
-            <w:pPr>
-              <w:spacing w:after="40"/>
-              <w:jc w:val="center"/>
-            </w:pPr>
-            <w:r/>
-            <w:r>
-              <w:rPr>
-                <w:sz w:val="20"/>
-              </w:rPr>
-              <w:t>Concordo totalmente</w:t>
-            </w:r>
-          </w:p>
-        </w:tc>
-      </w:tr>
-    </w:tbl>
-    <w:p/>
-    <w:p>
-      <w:r>
-        <w:br w:type="page"/>
-      </w:r>
-    </w:p>
-    <w:p>
-      <w:pPr>
-        <w:pStyle w:val="Heading1"/>
-      </w:pPr>
-      <w:r>
-        <w:t>3. Questionário: equipe de compras</w:t>
+        <w:t>Parte 1: equipe de compras</w:t>
       </w:r>
     </w:p>
     <w:p>
@@ -954,15 +182,6 @@
       </w:pPr>
       <w:r>
         <w:t>Bloco B: Utilidade Percebida (UP)</w:t>
-      </w:r>
-    </w:p>
-    <w:p>
-      <w:r>
-        <w:rPr>
-          <w:i/>
-          <w:sz w:val="18"/>
-        </w:rPr>
-        <w:t>UP1 a UP6 adaptam os seis itens originais de Davis (1989). UP7 e UP8 cobrem o apoio à decisão e a automação, que são o objetivo central do Provisa.</w:t>
       </w:r>
     </w:p>
     <w:tbl>
@@ -2265,15 +1484,6 @@
         <w:t>Bloco C: Facilidade de Uso Percebida (FUP)</w:t>
       </w:r>
     </w:p>
-    <w:p>
-      <w:r>
-        <w:rPr>
-          <w:i/>
-          <w:sz w:val="18"/>
-        </w:rPr>
-        <w:t>Os seis itens adaptam a escala original de Davis (1989) sem acréscimos, para manter a comparabilidade com outros estudos.</w:t>
-      </w:r>
-    </w:p>
     <w:tbl>
       <w:tblPr>
         <w:tblStyle w:val="TableGrid"/>
@@ -3291,15 +2501,6 @@
       </w:pPr>
       <w:r>
         <w:t>Bloco D: Atitude e Intenção de Uso</w:t>
-      </w:r>
-    </w:p>
-    <w:p>
-      <w:r>
-        <w:rPr>
-          <w:i/>
-          <w:sz w:val="18"/>
-        </w:rPr>
-        <w:t>Estes itens mostram se as percepções de utilidade e facilidade se convertem em vontade de adotar o sistema.</w:t>
       </w:r>
     </w:p>
     <w:tbl>
@@ -4421,7 +3622,7 @@
         <w:pStyle w:val="Heading1"/>
       </w:pPr>
       <w:r>
-        <w:t>4. Questionário: fornecedores</w:t>
+        <w:t>Parte 2: fornecedores</w:t>
       </w:r>
     </w:p>
     <w:p>
@@ -4442,11 +3643,7 @@
     </w:p>
     <w:p>
       <w:r>
-        <w:rPr>
-          <w:i/>
-          <w:sz w:val="18"/>
-        </w:rPr>
-        <w:t>O fornecedor usa só o portal de resposta, então recebe uma versão reduzida. Aplique depois que ele responder uma cotação pelo link do e-mail, de preferência pelo celular.</w:t>
+        <w:t>Responda depois de enviar uma cotação pelo link recebido por e-mail.</w:t>
       </w:r>
     </w:p>
     <w:tbl>
@@ -5633,474 +4830,6 @@
         <w:t>________________________________________________________________________</w:t>
       </w:r>
     </w:p>
-    <w:p>
-      <w:r>
-        <w:br w:type="page"/>
-      </w:r>
-    </w:p>
-    <w:p>
-      <w:pPr>
-        <w:pStyle w:val="Heading1"/>
-      </w:pPr>
-      <w:r>
-        <w:t>5. Como analisar os resultados</w:t>
-      </w:r>
-    </w:p>
-    <w:p>
-      <w:r>
-        <w:t>Para cada construto, calcule a média das respostas e o percentual de concordância (notas 4 e 5). Uma média de 4,0 ou mais, com 70% ou mais de concordância, indica boa aceitação.</w:t>
-      </w:r>
-    </w:p>
-    <w:tbl>
-      <w:tblPr>
-        <w:tblStyle w:val="TableGrid"/>
-        <w:tblW w:type="auto" w:w="0"/>
-        <w:jc w:val="center"/>
-        <w:tblLayout w:type="fixed"/>
-        <w:tblLook w:firstColumn="1" w:firstRow="1" w:lastColumn="0" w:lastRow="0" w:noHBand="0" w:noVBand="1" w:val="04A0"/>
-      </w:tblPr>
-      <w:tblGrid>
-        <w:gridCol w:w="2154"/>
-        <w:gridCol w:w="3175"/>
-        <w:gridCol w:w="3742"/>
-      </w:tblGrid>
-      <w:tr>
-        <w:trPr>
-          <w:tblHeader w:val="true"/>
-        </w:trPr>
-        <w:tc>
-          <w:tcPr>
-            <w:tcW w:type="dxa" w:w="2154"/>
-            <w:shd w:val="clear" w:color="auto" w:fill="154C47"/>
-            <w:vAlign w:val="center"/>
-          </w:tcPr>
-          <w:p>
-            <w:r/>
-            <w:r>
-              <w:rPr>
-                <w:b/>
-                <w:color w:val="FFFFFF"/>
-                <w:sz w:val="18"/>
-              </w:rPr>
-              <w:t>Medida</w:t>
-            </w:r>
-          </w:p>
-        </w:tc>
-        <w:tc>
-          <w:tcPr>
-            <w:tcW w:type="dxa" w:w="3175"/>
-            <w:shd w:val="clear" w:color="auto" w:fill="154C47"/>
-            <w:vAlign w:val="center"/>
-          </w:tcPr>
-          <w:p>
-            <w:r/>
-            <w:r>
-              <w:rPr>
-                <w:b/>
-                <w:color w:val="FFFFFF"/>
-                <w:sz w:val="18"/>
-              </w:rPr>
-              <w:t>Como calcular</w:t>
-            </w:r>
-          </w:p>
-        </w:tc>
-        <w:tc>
-          <w:tcPr>
-            <w:tcW w:type="dxa" w:w="3742"/>
-            <w:shd w:val="clear" w:color="auto" w:fill="154C47"/>
-            <w:vAlign w:val="center"/>
-          </w:tcPr>
-          <w:p>
-            <w:r/>
-            <w:r>
-              <w:rPr>
-                <w:b/>
-                <w:color w:val="FFFFFF"/>
-                <w:sz w:val="18"/>
-              </w:rPr>
-              <w:t>Leitura</w:t>
-            </w:r>
-          </w:p>
-        </w:tc>
-      </w:tr>
-      <w:tr>
-        <w:trPr>
-          <w:cantSplit w:val="true"/>
-        </w:trPr>
-        <w:tc>
-          <w:tcPr>
-            <w:tcW w:type="dxa" w:w="2154"/>
-            <w:vAlign w:val="center"/>
-          </w:tcPr>
-          <w:p>
-            <w:pPr>
-              <w:spacing w:after="40"/>
-            </w:pPr>
-            <w:r/>
-            <w:r>
-              <w:rPr>
-                <w:sz w:val="20"/>
-              </w:rPr>
-              <w:t>Média e mediana por item</w:t>
-            </w:r>
-          </w:p>
-        </w:tc>
-        <w:tc>
-          <w:tcPr>
-            <w:tcW w:type="dxa" w:w="3175"/>
-            <w:vAlign w:val="center"/>
-          </w:tcPr>
-          <w:p>
-            <w:pPr>
-              <w:spacing w:after="40"/>
-            </w:pPr>
-            <w:r/>
-            <w:r>
-              <w:rPr>
-                <w:sz w:val="20"/>
-              </w:rPr>
-              <w:t>Média simples das notas de 1 a 5</w:t>
-            </w:r>
-          </w:p>
-        </w:tc>
-        <w:tc>
-          <w:tcPr>
-            <w:tcW w:type="dxa" w:w="3742"/>
-            <w:vAlign w:val="center"/>
-          </w:tcPr>
-          <w:p>
-            <w:pPr>
-              <w:spacing w:after="40"/>
-            </w:pPr>
-            <w:r/>
-            <w:r>
-              <w:rPr>
-                <w:sz w:val="20"/>
-              </w:rPr>
-              <w:t>Mostra os itens mais fortes e mais fracos</w:t>
-            </w:r>
-          </w:p>
-        </w:tc>
-      </w:tr>
-      <w:tr>
-        <w:trPr>
-          <w:cantSplit w:val="true"/>
-        </w:trPr>
-        <w:tc>
-          <w:tcPr>
-            <w:tcW w:type="dxa" w:w="2154"/>
-            <w:vAlign w:val="center"/>
-            <w:shd w:val="clear" w:color="auto" w:fill="EEF7F5"/>
-          </w:tcPr>
-          <w:p>
-            <w:pPr>
-              <w:spacing w:after="40"/>
-            </w:pPr>
-            <w:r/>
-            <w:r>
-              <w:rPr>
-                <w:sz w:val="20"/>
-              </w:rPr>
-              <w:t>Média do construto</w:t>
-            </w:r>
-          </w:p>
-        </w:tc>
-        <w:tc>
-          <w:tcPr>
-            <w:tcW w:type="dxa" w:w="3175"/>
-            <w:vAlign w:val="center"/>
-            <w:shd w:val="clear" w:color="auto" w:fill="EEF7F5"/>
-          </w:tcPr>
-          <w:p>
-            <w:pPr>
-              <w:spacing w:after="40"/>
-            </w:pPr>
-            <w:r/>
-            <w:r>
-              <w:rPr>
-                <w:sz w:val="20"/>
-              </w:rPr>
-              <w:t>Média dos itens do bloco (UP, FUP, AT, IU)</w:t>
-            </w:r>
-          </w:p>
-        </w:tc>
-        <w:tc>
-          <w:tcPr>
-            <w:tcW w:type="dxa" w:w="3742"/>
-            <w:vAlign w:val="center"/>
-            <w:shd w:val="clear" w:color="auto" w:fill="EEF7F5"/>
-          </w:tcPr>
-          <w:p>
-            <w:pPr>
-              <w:spacing w:after="40"/>
-            </w:pPr>
-            <w:r/>
-            <w:r>
-              <w:rPr>
-                <w:sz w:val="20"/>
-              </w:rPr>
-              <w:t>Abaixo de 3,0 = rejeição; de 3,0 a 3,9 = aceitação parcial; 4,0 ou mais = boa aceitação</w:t>
-            </w:r>
-          </w:p>
-        </w:tc>
-      </w:tr>
-      <w:tr>
-        <w:trPr>
-          <w:cantSplit w:val="true"/>
-        </w:trPr>
-        <w:tc>
-          <w:tcPr>
-            <w:tcW w:type="dxa" w:w="2154"/>
-            <w:vAlign w:val="center"/>
-          </w:tcPr>
-          <w:p>
-            <w:pPr>
-              <w:spacing w:after="40"/>
-            </w:pPr>
-            <w:r/>
-            <w:r>
-              <w:rPr>
-                <w:sz w:val="20"/>
-              </w:rPr>
-              <w:t>Concordância</w:t>
-            </w:r>
-          </w:p>
-        </w:tc>
-        <w:tc>
-          <w:tcPr>
-            <w:tcW w:type="dxa" w:w="3175"/>
-            <w:vAlign w:val="center"/>
-          </w:tcPr>
-          <w:p>
-            <w:pPr>
-              <w:spacing w:after="40"/>
-            </w:pPr>
-            <w:r/>
-            <w:r>
-              <w:rPr>
-                <w:sz w:val="20"/>
-              </w:rPr>
-              <w:t>Respostas 4 ou 5 dividido pelo total de respostas</w:t>
-            </w:r>
-          </w:p>
-        </w:tc>
-        <w:tc>
-          <w:tcPr>
-            <w:tcW w:type="dxa" w:w="3742"/>
-            <w:vAlign w:val="center"/>
-          </w:tcPr>
-          <w:p>
-            <w:pPr>
-              <w:spacing w:after="40"/>
-            </w:pPr>
-            <w:r/>
-            <w:r>
-              <w:rPr>
-                <w:sz w:val="20"/>
-              </w:rPr>
-              <w:t>70% ou mais = aceitação pela maioria</w:t>
-            </w:r>
-          </w:p>
-        </w:tc>
-      </w:tr>
-      <w:tr>
-        <w:trPr>
-          <w:cantSplit w:val="true"/>
-        </w:trPr>
-        <w:tc>
-          <w:tcPr>
-            <w:tcW w:type="dxa" w:w="2154"/>
-            <w:vAlign w:val="center"/>
-            <w:shd w:val="clear" w:color="auto" w:fill="EEF7F5"/>
-          </w:tcPr>
-          <w:p>
-            <w:pPr>
-              <w:spacing w:after="40"/>
-            </w:pPr>
-            <w:r/>
-            <w:r>
-              <w:rPr>
-                <w:sz w:val="20"/>
-              </w:rPr>
-              <w:t>Confiabilidade</w:t>
-            </w:r>
-          </w:p>
-        </w:tc>
-        <w:tc>
-          <w:tcPr>
-            <w:tcW w:type="dxa" w:w="3175"/>
-            <w:vAlign w:val="center"/>
-            <w:shd w:val="clear" w:color="auto" w:fill="EEF7F5"/>
-          </w:tcPr>
-          <w:p>
-            <w:pPr>
-              <w:spacing w:after="40"/>
-            </w:pPr>
-            <w:r/>
-            <w:r>
-              <w:rPr>
-                <w:sz w:val="20"/>
-              </w:rPr>
-              <w:t>Alfa de Cronbach por construto</w:t>
-            </w:r>
-          </w:p>
-        </w:tc>
-        <w:tc>
-          <w:tcPr>
-            <w:tcW w:type="dxa" w:w="3742"/>
-            <w:vAlign w:val="center"/>
-            <w:shd w:val="clear" w:color="auto" w:fill="EEF7F5"/>
-          </w:tcPr>
-          <w:p>
-            <w:pPr>
-              <w:spacing w:after="40"/>
-            </w:pPr>
-            <w:r/>
-            <w:r>
-              <w:rPr>
-                <w:sz w:val="20"/>
-              </w:rPr>
-              <w:t>0,70 ou mais = os itens medem o mesmo conceito</w:t>
-            </w:r>
-          </w:p>
-        </w:tc>
-      </w:tr>
-      <w:tr>
-        <w:trPr>
-          <w:cantSplit w:val="true"/>
-        </w:trPr>
-        <w:tc>
-          <w:tcPr>
-            <w:tcW w:type="dxa" w:w="2154"/>
-            <w:vAlign w:val="center"/>
-          </w:tcPr>
-          <w:p>
-            <w:pPr>
-              <w:spacing w:after="40"/>
-            </w:pPr>
-            <w:r/>
-            <w:r>
-              <w:rPr>
-                <w:sz w:val="20"/>
-              </w:rPr>
-              <w:t>Relações do TAM (opcional)</w:t>
-            </w:r>
-          </w:p>
-        </w:tc>
-        <w:tc>
-          <w:tcPr>
-            <w:tcW w:type="dxa" w:w="3175"/>
-            <w:vAlign w:val="center"/>
-          </w:tcPr>
-          <w:p>
-            <w:pPr>
-              <w:spacing w:after="40"/>
-            </w:pPr>
-            <w:r/>
-            <w:r>
-              <w:rPr>
-                <w:sz w:val="20"/>
-              </w:rPr>
-              <w:t>Correlação de Spearman entre as médias de FUP e UP, e de UP e IU</w:t>
-            </w:r>
-          </w:p>
-        </w:tc>
-        <w:tc>
-          <w:tcPr>
-            <w:tcW w:type="dxa" w:w="3742"/>
-            <w:vAlign w:val="center"/>
-          </w:tcPr>
-          <w:p>
-            <w:pPr>
-              <w:spacing w:after="40"/>
-            </w:pPr>
-            <w:r/>
-            <w:r>
-              <w:rPr>
-                <w:sz w:val="20"/>
-              </w:rPr>
-              <w:t>Positiva e significativa = confirma o modelo</w:t>
-            </w:r>
-          </w:p>
-        </w:tc>
-      </w:tr>
-    </w:tbl>
-    <w:p/>
-    <w:p>
-      <w:r>
-        <w:rPr>
-          <w:b/>
-        </w:rPr>
-        <w:t xml:space="preserve">Alfa de Cronbach: </w:t>
-      </w:r>
-      <w:r>
-        <w:t>α = k / (k − 1) × (1 − Σσᵢ² / σₜ²), em que k é o número de itens do construto, σᵢ² a variância de cada item e σₜ² a variância da soma dos itens.</w:t>
-      </w:r>
-    </w:p>
-    <w:p>
-      <w:r>
-        <w:t>Com menos de 10 respondentes, o alfa e a correlação ficam instáveis. Nesse caso, apresente só a análise descritiva e cite essa limitação. Junte os resultados às métricas da tela Avaliação (H1 a H4) do Provisa: o questionário mede a percepção, e o sistema mede o tempo e as etapas reais.</w:t>
-      </w:r>
-    </w:p>
-    <w:p>
-      <w:pPr>
-        <w:pStyle w:val="Heading1"/>
-      </w:pPr>
-      <w:r>
-        <w:t>Referências</w:t>
-      </w:r>
-    </w:p>
-    <w:p>
-      <w:pPr>
-        <w:ind w:firstLine="0"/>
-      </w:pPr>
-      <w:r>
-        <w:t xml:space="preserve">DAVIS, F. D. Perceived usefulness, perceived ease of use, and user acceptance of information technology. </w:t>
-      </w:r>
-      <w:r>
-        <w:rPr>
-          <w:b/>
-        </w:rPr>
-        <w:t>MIS Quarterly</w:t>
-      </w:r>
-      <w:r>
-        <w:t>, v. 13, n. 3, p. 319-340, 1989.</w:t>
-      </w:r>
-    </w:p>
-    <w:p>
-      <w:pPr>
-        <w:ind w:firstLine="0"/>
-      </w:pPr>
-      <w:r>
-        <w:t xml:space="preserve">DAVIS, F. D.; BAGOZZI, R. P.; WARSHAW, P. R. User acceptance of computer technology: a comparison of two theoretical models. </w:t>
-      </w:r>
-      <w:r>
-        <w:rPr>
-          <w:b/>
-        </w:rPr>
-        <w:t>Management Science</w:t>
-      </w:r>
-      <w:r>
-        <w:t>, v. 35, n. 8, p. 982-1003, 1989.</w:t>
-      </w:r>
-    </w:p>
-    <w:p>
-      <w:pPr>
-        <w:ind w:firstLine="0"/>
-      </w:pPr>
-      <w:r>
-        <w:t xml:space="preserve">CRONBACH, L. J. Coefficient alpha and the internal structure of tests. </w:t>
-      </w:r>
-      <w:r>
-        <w:rPr>
-          <w:b/>
-        </w:rPr>
-        <w:t>Psychometrika</w:t>
-      </w:r>
-      <w:r>
-        <w:t>, v. 16, n. 3, p. 297-334, 1951.</w:t>
-      </w:r>
-    </w:p>
     <w:sectPr>
       <w:pgSz w:w="12240" w:h="15840"/>
       <w:pgMar w:top="1134" w:right="1134" w:bottom="1134" w:left="1417" w:header="720" w:footer="720" w:gutter="0"/>

</xml_diff>

<commit_message>
Questionário sem subtítulo e linha do TCC
Co-Authored-By: Claude Opus 5.5 (1M context) <noreply@anthropic.com>
Claude-Session: https://claude.ai/code/session_013Ez8WdXVGnAz1jp93VScRd
</commit_message>
<xml_diff>
--- a/docs/questionario/questionario-TAM-provisa.docx
+++ b/docs/questionario/questionario-TAM-provisa.docx
@@ -13,28 +13,6 @@
           <w:sz w:val="36"/>
         </w:rPr>
         <w:t>Questionário de avaliação do Provisa</w:t>
-      </w:r>
-    </w:p>
-    <w:p>
-      <w:pPr>
-        <w:jc w:val="center"/>
-      </w:pPr>
-      <w:r>
-        <w:t>Aceitação de tecnologia baseada no TAM (Davis, 1989)</w:t>
-      </w:r>
-    </w:p>
-    <w:p>
-      <w:pPr>
-        <w:jc w:val="center"/>
-      </w:pPr>
-      <w:r>
-        <w:rPr>
-          <w:color w:val="64748B"/>
-          <w:sz w:val="18"/>
-        </w:rPr>
-        <w:t>TCC: Sistema Web de Apoio à Decisão na Gestão de Compras com Integração via API e Automação de Cotações</w:t>
-        <w:br/>
-        <w:t>Matheus Negrelli · Sistemas de Informação · UNESC</w:t>
       </w:r>
     </w:p>
     <w:p>

</xml_diff>